<commit_message>
Doc with other logo added
</commit_message>
<xml_diff>
--- a/docs/NutriSense_Details.docx
+++ b/docs/NutriSense_Details.docx
@@ -233,7 +233,6 @@
                                 <w:szCs w:val="100"/>
                               </w:rPr>
                             </w:pPr>
-                            <w:proofErr w:type="spellStart"/>
                             <w:r>
                               <w:rPr>
                                 <w:rFonts w:ascii="Poppins" w:eastAsia="Poppins" w:hAnsi="Poppins" w:cs="Poppins"/>
@@ -245,7 +244,6 @@
                               </w:rPr>
                               <w:t>NutriSense</w:t>
                             </w:r>
-                            <w:proofErr w:type="spellEnd"/>
                           </w:p>
                           <w:p>
                             <w:pPr>
@@ -589,7 +587,6 @@
                           <w:szCs w:val="100"/>
                         </w:rPr>
                       </w:pPr>
-                      <w:proofErr w:type="spellStart"/>
                       <w:r>
                         <w:rPr>
                           <w:rFonts w:ascii="Poppins" w:eastAsia="Poppins" w:hAnsi="Poppins" w:cs="Poppins"/>
@@ -601,7 +598,6 @@
                         </w:rPr>
                         <w:t>NutriSense</w:t>
                       </w:r>
-                      <w:proofErr w:type="spellEnd"/>
                     </w:p>
                     <w:p>
                       <w:pPr>
@@ -983,7 +979,7 @@
           <w:noProof/>
         </w:rPr>
         <w:drawing>
-          <wp:anchor distT="0" distB="0" distL="114300" distR="114300" simplePos="0" relativeHeight="251663360" behindDoc="0" locked="0" layoutInCell="1" allowOverlap="1" wp14:anchorId="3546B194" wp14:editId="133AD5FD">
+          <wp:anchor distT="0" distB="0" distL="114300" distR="114300" simplePos="0" relativeHeight="251663360" behindDoc="0" locked="0" layoutInCell="1" allowOverlap="1" wp14:anchorId="3546B194" wp14:editId="4CCEB131">
             <wp:simplePos x="0" y="0"/>
             <wp:positionH relativeFrom="column">
               <wp:posOffset>2402840</wp:posOffset>
@@ -4065,21 +4061,8 @@
       <w:pPr>
         <w:pStyle w:val="Para"/>
       </w:pPr>
-      <w:proofErr w:type="spellStart"/>
-      <w:r>
-        <w:t>NutriSense</w:t>
-      </w:r>
-      <w:proofErr w:type="spellEnd"/>
-      <w:r>
-        <w:t xml:space="preserve"> is an enterprise-grade, AI-powered nutritional intelligence, fasting management, and clinical health platform designed specifically for Pakistani and South Asian users. Engineered to combat the national surge in lifestyle-related metabolic disorders—principally Type 2 Diabetes, Hypertension, and Obesity—</w:t>
-      </w:r>
-      <w:proofErr w:type="spellStart"/>
-      <w:r>
-        <w:t>NutriSense</w:t>
-      </w:r>
-      <w:proofErr w:type="spellEnd"/>
-      <w:r>
-        <w:t xml:space="preserve"> makes personalized, culturally-accurate nutrition and fitness guidance accessible to every household, regardless of income.</w:t>
+      <w:r>
+        <w:t>NutriSense is an enterprise-grade, AI-powered nutritional intelligence, fasting management, and clinical health platform designed specifically for Pakistani and South Asian users. Engineered to combat the national surge in lifestyle-related metabolic disorders—principally Type 2 Diabetes, Hypertension, and Obesity—NutriSense makes personalized, culturally-accurate nutrition and fitness guidance accessible to every household, regardless of income.</w:t>
       </w:r>
     </w:p>
     <w:p>
@@ -4110,31 +4093,7 @@
         <w:t>The Problem:</w:t>
       </w:r>
       <w:r>
-        <w:t xml:space="preserve"> Pakistan faces a nutrition crisis – over 33% of adults are diabetic or pre-diabetic, with rising obesity, micronutrient deficiencies, and a high poverty rate that leaves most families unable to afford professional nutritionist consultations. Existing nutrition apps are built for Western diets: they ignore traditional portion units (</w:t>
-      </w:r>
-      <w:proofErr w:type="spellStart"/>
-      <w:r>
-        <w:t>katori</w:t>
-      </w:r>
-      <w:proofErr w:type="spellEnd"/>
-      <w:r>
-        <w:t xml:space="preserve">, roti, naan), don't account for fasting practices like Ramadan, and are English-only – excluding </w:t>
-      </w:r>
-      <w:proofErr w:type="gramStart"/>
-      <w:r>
-        <w:t>the majority of</w:t>
-      </w:r>
-      <w:proofErr w:type="gramEnd"/>
-      <w:r>
-        <w:t xml:space="preserve"> users. Patients with diabetes or hypertension receive no personalized, </w:t>
-      </w:r>
-      <w:proofErr w:type="gramStart"/>
-      <w:r>
-        <w:t>clinically-safe</w:t>
-      </w:r>
-      <w:proofErr w:type="gramEnd"/>
-      <w:r>
-        <w:t xml:space="preserve"> dietary or exercise guidance, and families managing nutrition for children or elderly parents have no unified tool.</w:t>
+        <w:t xml:space="preserve"> Pakistan faces a nutrition crisis – over 33% of adults are diabetic or pre-diabetic, with rising obesity, micronutrient deficiencies, and a high poverty rate that leaves most families unable to afford professional nutritionist consultations. Existing nutrition apps are built for Western diets: they ignore traditional portion units (katori, roti, naan), don't account for fasting practices like Ramadan, and are English-only – excluding the majority of users. Patients with diabetes or hypertension receive no personalized, clinically-safe dietary or exercise guidance, and families managing nutrition for children or elderly parents have no unified tool.</w:t>
       </w:r>
     </w:p>
     <w:p>
@@ -4196,31 +4155,7 @@
         <w:t>The Solution:</w:t>
       </w:r>
       <w:r>
-        <w:t xml:space="preserve"> </w:t>
-      </w:r>
-      <w:proofErr w:type="spellStart"/>
-      <w:r>
-        <w:t>NutriSense</w:t>
-      </w:r>
-      <w:proofErr w:type="spellEnd"/>
-      <w:r>
-        <w:t xml:space="preserve"> is an AI-powered nutrition and metabolic health assistant designed specifically for Pakistani and South Asian users. Using Google Gemini AI, it calculates personalized macro targets based on medical conditions and recommends tailored workout and exercise strategies matched to each user's needs – such as strength training and calorie-dense meal plans for underweight individuals, and safe, low-impact routines for diabetics and hypertension patients. It provides a </w:t>
-      </w:r>
-      <w:proofErr w:type="gramStart"/>
-      <w:r>
-        <w:t>clinically-guarded</w:t>
-      </w:r>
-      <w:proofErr w:type="gramEnd"/>
-      <w:r>
-        <w:t xml:space="preserve"> AI coach that detects high-risk patterns (like hypoglycemia) and escalates to care. It includes a Ramadan fasting mode with Sehri/Iftar schedules and split hydration, multi-family profile management, bilingual English/Urdu support, offline-first sync, and weekly PDF health reports. </w:t>
-      </w:r>
-      <w:proofErr w:type="spellStart"/>
-      <w:r>
-        <w:t>NutriSense</w:t>
-      </w:r>
-      <w:proofErr w:type="spellEnd"/>
-      <w:r>
-        <w:t xml:space="preserve"> makes personalized, culturally-accurate nutrition and fitness guidance accessible to every Pakistani household – regardless of income.</w:t>
+        <w:t xml:space="preserve"> NutriSense is an AI-powered nutrition and metabolic health assistant designed specifically for Pakistani and South Asian users. Using Google Gemini AI, it calculates personalized macro targets based on medical conditions and recommends tailored workout and exercise strategies matched to each user's needs – such as strength training and calorie-dense meal plans for underweight individuals, and safe, low-impact routines for diabetics and hypertension patients. It provides a clinically-guarded AI coach that detects high-risk patterns (like hypoglycemia) and escalates to care. It includes a Ramadan fasting mode with Sehri/Iftar schedules and split hydration, multi-family profile management, bilingual English/Urdu support, offline-first sync, and weekly PDF health reports. NutriSense makes personalized, culturally-accurate nutrition and fitness guidance accessible to every Pakistani household – regardless of income.</w:t>
       </w:r>
     </w:p>
     <w:p>
@@ -4259,13 +4194,8 @@
       <w:pPr>
         <w:pStyle w:val="Para"/>
       </w:pPr>
-      <w:proofErr w:type="spellStart"/>
-      <w:r>
-        <w:t>NutriSense</w:t>
-      </w:r>
-      <w:proofErr w:type="spellEnd"/>
-      <w:r>
-        <w:t xml:space="preserve"> adopts a modern, decoupled, multi-tier client-server architecture designed for high availability, sub-second latency, and enterprise security compliance.</w:t>
+      <w:r>
+        <w:t>NutriSense adopts a modern, decoupled, multi-tier client-server architecture designed for high availability, sub-second latency, and enterprise security compliance.</w:t>
       </w:r>
     </w:p>
     <w:p>
@@ -4319,23 +4249,7 @@
         <w:t>State &amp; Service Controller Layer:</w:t>
       </w:r>
       <w:r>
-        <w:t xml:space="preserve"> Reactive </w:t>
-      </w:r>
-      <w:proofErr w:type="spellStart"/>
-      <w:r>
-        <w:t>ListenableBuilder</w:t>
-      </w:r>
-      <w:proofErr w:type="spellEnd"/>
-      <w:r>
-        <w:t xml:space="preserve"> controllers, Singleton </w:t>
-      </w:r>
-      <w:proofErr w:type="spellStart"/>
-      <w:r>
-        <w:t>ViewModels</w:t>
-      </w:r>
-      <w:proofErr w:type="spellEnd"/>
-      <w:r>
-        <w:t>, and background sync workers managing local business logic.</w:t>
+        <w:t xml:space="preserve"> Reactive ListenableBuilder controllers, Singleton ViewModels, and background sync workers managing local business logic.</w:t>
       </w:r>
     </w:p>
     <w:p>
@@ -4380,15 +4294,7 @@
         <w:t>Data Persistence Layer:</w:t>
       </w:r>
       <w:r>
-        <w:t xml:space="preserve"> </w:t>
-      </w:r>
-      <w:proofErr w:type="spellStart"/>
-      <w:r>
-        <w:t>Supabase</w:t>
-      </w:r>
-      <w:proofErr w:type="spellEnd"/>
-      <w:r>
-        <w:t xml:space="preserve"> PostgreSQL with Row Level Security (RLS) policies coupled with an offline-first mobile SQLite caching layer.</w:t>
+        <w:t xml:space="preserve"> Supabase PostgreSQL with Row Level Security (RLS) policies coupled with an offline-first mobile SQLite caching layer.</w:t>
       </w:r>
     </w:p>
     <w:p>
@@ -4583,13 +4489,8 @@
               <w:pStyle w:val="TableNormal0"/>
             </w:pPr>
             <w:r>
-              <w:t xml:space="preserve">Provider &amp; </w:t>
+              <w:t>Provider &amp; ListenableBuilder</w:t>
             </w:r>
-            <w:proofErr w:type="spellStart"/>
-            <w:r>
-              <w:t>ListenableBuilder</w:t>
-            </w:r>
-            <w:proofErr w:type="spellEnd"/>
           </w:p>
         </w:tc>
         <w:tc>
@@ -4602,15 +4503,7 @@
               <w:pStyle w:val="TableNormal0"/>
             </w:pPr>
             <w:r>
-              <w:t xml:space="preserve">Lightweight, reactive state propagation for </w:t>
-            </w:r>
-            <w:proofErr w:type="spellStart"/>
-            <w:r>
-              <w:t>ViewModels</w:t>
-            </w:r>
-            <w:proofErr w:type="spellEnd"/>
-            <w:r>
-              <w:t xml:space="preserve"> and controllers.</w:t>
+              <w:t>Lightweight, reactive state propagation for ViewModels and controllers.</w:t>
             </w:r>
           </w:p>
         </w:tc>
@@ -4642,13 +4535,8 @@
             <w:pPr>
               <w:pStyle w:val="TableNormal0"/>
             </w:pPr>
-            <w:proofErr w:type="spellStart"/>
             <w:r>
-              <w:t>sqflite</w:t>
-            </w:r>
-            <w:proofErr w:type="spellEnd"/>
-            <w:r>
-              <w:t xml:space="preserve"> / SQLite</w:t>
+              <w:t>sqflite / SQLite</w:t>
             </w:r>
           </w:p>
         </w:tc>
@@ -4662,15 +4550,7 @@
               <w:pStyle w:val="TableNormal0"/>
             </w:pPr>
             <w:r>
-              <w:t xml:space="preserve">Offline-first transactional local cache for meal logs, </w:t>
-            </w:r>
-            <w:proofErr w:type="gramStart"/>
-            <w:r>
-              <w:t>water logs</w:t>
-            </w:r>
-            <w:proofErr w:type="gramEnd"/>
-            <w:r>
-              <w:t>, and habits.</w:t>
+              <w:t>Offline-first transactional local cache for meal logs, water logs, and habits.</w:t>
             </w:r>
           </w:p>
         </w:tc>
@@ -4702,11 +4582,9 @@
             <w:pPr>
               <w:pStyle w:val="TableNormal0"/>
             </w:pPr>
-            <w:proofErr w:type="spellStart"/>
             <w:r>
               <w:t>shared_preferences</w:t>
             </w:r>
-            <w:proofErr w:type="spellEnd"/>
           </w:p>
         </w:tc>
         <w:tc>
@@ -4798,11 +4676,9 @@
             <w:pPr>
               <w:pStyle w:val="TableNormal0"/>
             </w:pPr>
-            <w:proofErr w:type="spellStart"/>
             <w:r>
               <w:t>flutter_tts</w:t>
             </w:r>
-            <w:proofErr w:type="spellEnd"/>
           </w:p>
         </w:tc>
         <w:tc>
@@ -4848,13 +4724,8 @@
               <w:pStyle w:val="TableNormal0"/>
             </w:pPr>
             <w:r>
-              <w:t xml:space="preserve">http &amp; </w:t>
+              <w:t>http &amp; connectivity_plus</w:t>
             </w:r>
-            <w:proofErr w:type="spellStart"/>
-            <w:r>
-              <w:t>connectivity_plus</w:t>
-            </w:r>
-            <w:proofErr w:type="spellEnd"/>
           </w:p>
         </w:tc>
         <w:tc>
@@ -5024,15 +4895,7 @@
               <w:pStyle w:val="TableNormal0"/>
             </w:pPr>
             <w:r>
-              <w:t xml:space="preserve">FastAPI / </w:t>
-            </w:r>
-            <w:proofErr w:type="spellStart"/>
-            <w:r>
-              <w:t>Uvicorn</w:t>
-            </w:r>
-            <w:proofErr w:type="spellEnd"/>
-            <w:r>
-              <w:t xml:space="preserve"> (ASGI)</w:t>
+              <w:t>FastAPI / Uvicorn (ASGI)</w:t>
             </w:r>
           </w:p>
         </w:tc>
@@ -5078,13 +4941,8 @@
             <w:pPr>
               <w:pStyle w:val="TableNormal0"/>
             </w:pPr>
-            <w:proofErr w:type="spellStart"/>
             <w:r>
-              <w:t>Supabase</w:t>
-            </w:r>
-            <w:proofErr w:type="spellEnd"/>
-            <w:r>
-              <w:t xml:space="preserve"> PostgreSQL</w:t>
+              <w:t>Supabase PostgreSQL</w:t>
             </w:r>
           </w:p>
         </w:tc>
@@ -5130,13 +4988,8 @@
             <w:pPr>
               <w:pStyle w:val="TableNormal0"/>
             </w:pPr>
-            <w:proofErr w:type="spellStart"/>
             <w:r>
-              <w:t>Supabase</w:t>
-            </w:r>
-            <w:proofErr w:type="spellEnd"/>
-            <w:r>
-              <w:t xml:space="preserve"> Auth (JWT)</w:t>
+              <w:t>Supabase Auth (JWT)</w:t>
             </w:r>
           </w:p>
         </w:tc>
@@ -5182,13 +5035,8 @@
             <w:pPr>
               <w:pStyle w:val="TableNormal0"/>
             </w:pPr>
-            <w:proofErr w:type="spellStart"/>
             <w:r>
-              <w:t>ReportLab</w:t>
-            </w:r>
-            <w:proofErr w:type="spellEnd"/>
-            <w:r>
-              <w:t xml:space="preserve"> Engine</w:t>
+              <w:t>ReportLab Engine</w:t>
             </w:r>
           </w:p>
         </w:tc>
@@ -5234,13 +5082,8 @@
             <w:pPr>
               <w:pStyle w:val="TableNormal0"/>
             </w:pPr>
-            <w:proofErr w:type="spellStart"/>
             <w:r>
-              <w:t>httpx</w:t>
-            </w:r>
-            <w:proofErr w:type="spellEnd"/>
-            <w:r>
-              <w:t xml:space="preserve"> (Async)</w:t>
+              <w:t>httpx (Async)</w:t>
             </w:r>
           </w:p>
         </w:tc>
@@ -5280,21 +5123,8 @@
       <w:pPr>
         <w:pStyle w:val="Para"/>
       </w:pPr>
-      <w:proofErr w:type="spellStart"/>
-      <w:r>
-        <w:t>NutriSense</w:t>
-      </w:r>
-      <w:proofErr w:type="spellEnd"/>
-      <w:r>
-        <w:t xml:space="preserve"> leverages Google's flagship Gemini models (gemini-2.5-flash and gemini-3.6-flash). To ensure 99.9% uptime and prevent service denial from Google API rate limits, a custom </w:t>
-      </w:r>
-      <w:proofErr w:type="spellStart"/>
-      <w:r>
-        <w:t>GeminiPool</w:t>
-      </w:r>
-      <w:proofErr w:type="spellEnd"/>
-      <w:r>
-        <w:t xml:space="preserve"> manager executes automatic round-robin load distribution and instant failover.</w:t>
+      <w:r>
+        <w:t>NutriSense leverages Google's flagship Gemini models (gemini-2.5-flash and gemini-3.6-flash). To ensure 99.9% uptime and prevent service denial from Google API rate limits, a custom GeminiPool manager executes automatic round-robin load distribution and instant failover.</w:t>
       </w:r>
     </w:p>
     <w:tbl>
@@ -5344,21 +5174,7 @@
               <w:rPr>
                 <w:rStyle w:val="TableNormalChar"/>
               </w:rPr>
-              <w:t xml:space="preserve">When an inference call triggers an HTTP 429 Quota Exceeded error, </w:t>
-            </w:r>
-            <w:proofErr w:type="spellStart"/>
-            <w:r>
-              <w:rPr>
-                <w:rStyle w:val="TableNormalChar"/>
-              </w:rPr>
-              <w:t>GeminiPool</w:t>
-            </w:r>
-            <w:proofErr w:type="spellEnd"/>
-            <w:r>
-              <w:rPr>
-                <w:rStyle w:val="TableNormalChar"/>
-              </w:rPr>
-              <w:t xml:space="preserve"> catches the exception, masks sensitive credentials in logs, instantly rotates the active index to the next verified key, and transparently completes inference in &lt;500ms without user interruption.</w:t>
+              <w:t>When an inference call triggers an HTTP 429 Quota Exceeded error, GeminiPool catches the exception, masks sensitive credentials in logs, instantly rotates the active index to the next verified key, and transparently completes inference in &lt;500ms without user interruption.</w:t>
             </w:r>
           </w:p>
         </w:tc>
@@ -5389,32 +5205,15 @@
       <w:pPr>
         <w:pStyle w:val="BulletPoint"/>
       </w:pPr>
-      <w:proofErr w:type="spellStart"/>
-      <w:r>
-        <w:rPr>
-          <w:b/>
-          <w:bCs/>
-        </w:rPr>
-        <w:t>OpenFoodFacts</w:t>
-      </w:r>
-      <w:proofErr w:type="spellEnd"/>
-      <w:r>
-        <w:rPr>
-          <w:b/>
-          <w:bCs/>
-        </w:rPr>
-        <w:t xml:space="preserve"> API:</w:t>
-      </w:r>
-      <w:r>
-        <w:t xml:space="preserve"> Global barcode lookup providing raw </w:t>
-      </w:r>
-      <w:proofErr w:type="gramStart"/>
-      <w:r>
-        <w:t>ingredient</w:t>
-      </w:r>
-      <w:proofErr w:type="gramEnd"/>
-      <w:r>
-        <w:t xml:space="preserve"> and nutritional metadata for packaged goods.</w:t>
+      <w:r>
+        <w:rPr>
+          <w:b/>
+          <w:bCs/>
+        </w:rPr>
+        <w:t>OpenFoodFacts API:</w:t>
+      </w:r>
+      <w:r>
+        <w:t xml:space="preserve"> Global barcode lookup providing raw ingredient and nutritional metadata for packaged goods.</w:t>
       </w:r>
     </w:p>
     <w:p>
@@ -5436,21 +5235,12 @@
       <w:pPr>
         <w:pStyle w:val="BulletPoint"/>
       </w:pPr>
-      <w:proofErr w:type="spellStart"/>
-      <w:r>
-        <w:rPr>
-          <w:b/>
-          <w:bCs/>
-        </w:rPr>
-        <w:t>Aladhan</w:t>
-      </w:r>
-      <w:proofErr w:type="spellEnd"/>
-      <w:r>
-        <w:rPr>
-          <w:b/>
-          <w:bCs/>
-        </w:rPr>
-        <w:t xml:space="preserve"> Prayer API:</w:t>
+      <w:r>
+        <w:rPr>
+          <w:b/>
+          <w:bCs/>
+        </w:rPr>
+        <w:t>Aladhan Prayer API:</w:t>
       </w:r>
       <w:r>
         <w:t xml:space="preserve"> Astronomical calculation engine providing exact daily Fajr (Sehri) and Maghrib (Iftar) timestamps based on GPS coordinates.</w:t>
@@ -5502,23 +5292,7 @@
         <w:pStyle w:val="Para"/>
       </w:pPr>
       <w:r>
-        <w:t xml:space="preserve">Here are eight foundational architectural and </w:t>
-      </w:r>
-      <w:proofErr w:type="spellStart"/>
-      <w:r>
-        <w:t>behavioural</w:t>
-      </w:r>
-      <w:proofErr w:type="spellEnd"/>
-      <w:r>
-        <w:t xml:space="preserve"> diagrams specifying </w:t>
-      </w:r>
-      <w:proofErr w:type="spellStart"/>
-      <w:r>
-        <w:t>NutriSense's</w:t>
-      </w:r>
-      <w:proofErr w:type="spellEnd"/>
-      <w:r>
-        <w:t xml:space="preserve"> software design. Each specification outlines the actors, component interactions, lifecycle states, and data pathways.</w:t>
+        <w:t>Here are eight foundational architectural and behavioural diagrams specifying NutriSense's software design. Each specification outlines the actors, component interactions, lifecycle states, and data pathways.</w:t>
       </w:r>
     </w:p>
     <w:p>
@@ -5624,15 +5398,7 @@
         <w:t>Reactive Data Binding:</w:t>
       </w:r>
       <w:r>
-        <w:t xml:space="preserve"> The Presentation layer (Flutter UI) communicates with the Controller layer using </w:t>
-      </w:r>
-      <w:proofErr w:type="spellStart"/>
-      <w:r>
-        <w:t>ViewModels</w:t>
-      </w:r>
-      <w:proofErr w:type="spellEnd"/>
-      <w:r>
-        <w:t xml:space="preserve"> and change notifier listeners, ensuring zero-latency interface updates.</w:t>
+        <w:t xml:space="preserve"> The Presentation layer (Flutter UI) communicates with the Controller layer using ViewModels and change notifier listeners, ensuring zero-latency interface updates.</w:t>
       </w:r>
     </w:p>
     <w:p>
@@ -5663,15 +5429,7 @@
         <w:t>Asynchronous Services:</w:t>
       </w:r>
       <w:r>
-        <w:t xml:space="preserve"> The Backend server coordinates external integrations (Gemini AI, OpenStreetMap, and </w:t>
-      </w:r>
-      <w:proofErr w:type="spellStart"/>
-      <w:r>
-        <w:t>OpenFoodFacts</w:t>
-      </w:r>
-      <w:proofErr w:type="spellEnd"/>
-      <w:r>
-        <w:t>) asynchronously without blocking database transactions.</w:t>
+        <w:t xml:space="preserve"> The Backend server coordinates external integrations (Gemini AI, OpenStreetMap, and OpenFoodFacts) asynchronously without blocking database transactions.</w:t>
       </w:r>
     </w:p>
     <w:p>
@@ -5686,15 +5444,7 @@
         <w:t>Dual-Database Persistence:</w:t>
       </w:r>
       <w:r>
-        <w:t xml:space="preserve"> Write actions are committed locally to a SQLite mobile database and mirrored securely in a remote </w:t>
-      </w:r>
-      <w:proofErr w:type="spellStart"/>
-      <w:r>
-        <w:t>Supabase</w:t>
-      </w:r>
-      <w:proofErr w:type="spellEnd"/>
-      <w:r>
-        <w:t xml:space="preserve"> PostgreSQL cloud database.</w:t>
+        <w:t xml:space="preserve"> Write actions are committed locally to a SQLite mobile database and mirrored securely in a remote Supabase PostgreSQL cloud database.</w:t>
       </w:r>
     </w:p>
     <w:p>
@@ -6120,13 +5870,8 @@
               <w:pStyle w:val="TableNormal0"/>
             </w:pPr>
             <w:r>
-              <w:t xml:space="preserve">id (UUID PK), email, </w:t>
+              <w:t>id (UUID PK), email, created_at</w:t>
             </w:r>
-            <w:proofErr w:type="spellStart"/>
-            <w:r>
-              <w:t>created_at</w:t>
-            </w:r>
-            <w:proofErr w:type="spellEnd"/>
           </w:p>
         </w:tc>
         <w:tc>
@@ -6139,15 +5884,7 @@
               <w:pStyle w:val="TableNormal0"/>
             </w:pPr>
             <w:r>
-              <w:t xml:space="preserve">Root </w:t>
-            </w:r>
-            <w:proofErr w:type="spellStart"/>
-            <w:r>
-              <w:t>Supabase</w:t>
-            </w:r>
-            <w:proofErr w:type="spellEnd"/>
-            <w:r>
-              <w:t xml:space="preserve"> Auth entity representing registered accounts.</w:t>
+              <w:t>Root Supabase Auth entity representing registered accounts.</w:t>
             </w:r>
           </w:p>
         </w:tc>
@@ -6165,11 +5902,9 @@
             <w:pPr>
               <w:pStyle w:val="TableNormal0"/>
             </w:pPr>
-            <w:proofErr w:type="spellStart"/>
             <w:r>
               <w:t>health_profiles</w:t>
             </w:r>
-            <w:proofErr w:type="spellEnd"/>
           </w:p>
         </w:tc>
         <w:tc>
@@ -6181,13 +5916,8 @@
             <w:pPr>
               <w:pStyle w:val="TableNormal0"/>
             </w:pPr>
-            <w:proofErr w:type="spellStart"/>
             <w:r>
-              <w:t>user_id</w:t>
-            </w:r>
-            <w:proofErr w:type="spellEnd"/>
-            <w:r>
-              <w:t xml:space="preserve"> (UUID FK), age, height, weight, goal, conditions[], allergies[]</w:t>
+              <w:t>user_id (UUID FK), age, height, weight, goal, conditions[], allergies[]</w:t>
             </w:r>
           </w:p>
         </w:tc>
@@ -6219,11 +5949,9 @@
             <w:pPr>
               <w:pStyle w:val="TableNormal0"/>
             </w:pPr>
-            <w:proofErr w:type="spellStart"/>
             <w:r>
               <w:t>family_members</w:t>
             </w:r>
-            <w:proofErr w:type="spellEnd"/>
           </w:p>
         </w:tc>
         <w:tc>
@@ -6236,15 +5964,7 @@
               <w:pStyle w:val="TableNormal0"/>
             </w:pPr>
             <w:r>
-              <w:t xml:space="preserve">id (UUID PK), </w:t>
-            </w:r>
-            <w:proofErr w:type="spellStart"/>
-            <w:r>
-              <w:t>primary_user_id</w:t>
-            </w:r>
-            <w:proofErr w:type="spellEnd"/>
-            <w:r>
-              <w:t xml:space="preserve"> (FK), name, relationship, age, conditions[]</w:t>
+              <w:t>id (UUID PK), primary_user_id (FK), name, relationship, age, conditions[]</w:t>
             </w:r>
           </w:p>
         </w:tc>
@@ -6258,15 +5978,7 @@
               <w:pStyle w:val="TableNormal0"/>
             </w:pPr>
             <w:r>
-              <w:t xml:space="preserve">1:N with users. Stores </w:t>
-            </w:r>
-            <w:proofErr w:type="gramStart"/>
-            <w:r>
-              <w:t>dependent</w:t>
-            </w:r>
-            <w:proofErr w:type="gramEnd"/>
-            <w:r>
-              <w:t xml:space="preserve"> sub-profiles for family tracking.</w:t>
+              <w:t>1:N with users. Stores dependent sub-profiles for family tracking.</w:t>
             </w:r>
           </w:p>
         </w:tc>
@@ -6284,11 +5996,9 @@
             <w:pPr>
               <w:pStyle w:val="TableNormal0"/>
             </w:pPr>
-            <w:proofErr w:type="spellStart"/>
             <w:r>
               <w:t>meal_logs</w:t>
             </w:r>
-            <w:proofErr w:type="spellEnd"/>
           </w:p>
         </w:tc>
         <w:tc>
@@ -6301,23 +6011,7 @@
               <w:pStyle w:val="TableNormal0"/>
             </w:pPr>
             <w:r>
-              <w:t xml:space="preserve">id (UUID PK), </w:t>
-            </w:r>
-            <w:proofErr w:type="spellStart"/>
-            <w:r>
-              <w:t>user_id</w:t>
-            </w:r>
-            <w:proofErr w:type="spellEnd"/>
-            <w:r>
-              <w:t xml:space="preserve"> (FK), </w:t>
-            </w:r>
-            <w:proofErr w:type="spellStart"/>
-            <w:r>
-              <w:t>family_member_id</w:t>
-            </w:r>
-            <w:proofErr w:type="spellEnd"/>
-            <w:r>
-              <w:t xml:space="preserve"> (FK), notes, calories, macros</w:t>
+              <w:t>id (UUID PK), user_id (FK), family_member_id (FK), notes, calories, macros</w:t>
             </w:r>
           </w:p>
         </w:tc>
@@ -6349,11 +6043,9 @@
             <w:pPr>
               <w:pStyle w:val="TableNormal0"/>
             </w:pPr>
-            <w:proofErr w:type="spellStart"/>
             <w:r>
               <w:t>chat_history</w:t>
             </w:r>
-            <w:proofErr w:type="spellEnd"/>
           </w:p>
         </w:tc>
         <w:tc>
@@ -6366,15 +6058,7 @@
               <w:pStyle w:val="TableNormal0"/>
             </w:pPr>
             <w:r>
-              <w:t xml:space="preserve">id (UUID PK), </w:t>
-            </w:r>
-            <w:proofErr w:type="spellStart"/>
-            <w:r>
-              <w:t>user_id</w:t>
-            </w:r>
-            <w:proofErr w:type="spellEnd"/>
-            <w:r>
-              <w:t xml:space="preserve"> (FK), sender, message, metadata, timestamp</w:t>
+              <w:t>id (UUID PK), user_id (FK), sender, message, metadata, timestamp</w:t>
             </w:r>
           </w:p>
         </w:tc>
@@ -6406,11 +6090,9 @@
             <w:pPr>
               <w:pStyle w:val="TableNormal0"/>
             </w:pPr>
-            <w:proofErr w:type="spellStart"/>
             <w:r>
               <w:t>water_logs</w:t>
             </w:r>
-            <w:proofErr w:type="spellEnd"/>
           </w:p>
         </w:tc>
         <w:tc>
@@ -6423,29 +6105,8 @@
               <w:pStyle w:val="TableNormal0"/>
             </w:pPr>
             <w:r>
-              <w:t xml:space="preserve">id (UUID PK), </w:t>
+              <w:t>id (UUID PK), user_id (FK), amount_ml, logged_at</w:t>
             </w:r>
-            <w:proofErr w:type="spellStart"/>
-            <w:r>
-              <w:t>user_id</w:t>
-            </w:r>
-            <w:proofErr w:type="spellEnd"/>
-            <w:r>
-              <w:t xml:space="preserve"> (FK), </w:t>
-            </w:r>
-            <w:proofErr w:type="spellStart"/>
-            <w:r>
-              <w:t>amount_ml</w:t>
-            </w:r>
-            <w:proofErr w:type="spellEnd"/>
-            <w:r>
-              <w:t xml:space="preserve">, </w:t>
-            </w:r>
-            <w:proofErr w:type="spellStart"/>
-            <w:r>
-              <w:t>logged_at</w:t>
-            </w:r>
-            <w:proofErr w:type="spellEnd"/>
           </w:p>
         </w:tc>
         <w:tc>
@@ -6476,12 +6137,10 @@
             <w:pPr>
               <w:pStyle w:val="TableNormal0"/>
             </w:pPr>
-            <w:proofErr w:type="spellStart"/>
             <w:r>
               <w:lastRenderedPageBreak/>
               <w:t>habit_scores</w:t>
             </w:r>
-            <w:proofErr w:type="spellEnd"/>
           </w:p>
         </w:tc>
         <w:tc>
@@ -6494,29 +6153,8 @@
               <w:pStyle w:val="TableNormal0"/>
             </w:pPr>
             <w:r>
-              <w:t xml:space="preserve">id (UUID PK), </w:t>
+              <w:t>id (UUID PK), user_id (FK), score, streak_days, last_calculated</w:t>
             </w:r>
-            <w:proofErr w:type="spellStart"/>
-            <w:r>
-              <w:t>user_id</w:t>
-            </w:r>
-            <w:proofErr w:type="spellEnd"/>
-            <w:r>
-              <w:t xml:space="preserve"> (FK), score, </w:t>
-            </w:r>
-            <w:proofErr w:type="spellStart"/>
-            <w:r>
-              <w:t>streak_days</w:t>
-            </w:r>
-            <w:proofErr w:type="spellEnd"/>
-            <w:r>
-              <w:t xml:space="preserve">, </w:t>
-            </w:r>
-            <w:proofErr w:type="spellStart"/>
-            <w:r>
-              <w:t>last_calculated</w:t>
-            </w:r>
-            <w:proofErr w:type="spellEnd"/>
           </w:p>
         </w:tc>
         <w:tc>
@@ -6562,15 +6200,7 @@
         <w:t>1-to-1 Profile Mapping:</w:t>
       </w:r>
       <w:r>
-        <w:t xml:space="preserve"> The `</w:t>
-      </w:r>
-      <w:proofErr w:type="spellStart"/>
-      <w:r>
-        <w:t>health_profiles</w:t>
-      </w:r>
-      <w:proofErr w:type="spellEnd"/>
-      <w:r>
-        <w:t>` table maintains a 1-to-1 relationship with `users` to store clinical metrics, medical conditions, and allergy rules.</w:t>
+        <w:t xml:space="preserve"> The `health_profiles` table maintains a 1-to-1 relationship with `users` to store clinical metrics, medical conditions, and allergy rules.</w:t>
       </w:r>
     </w:p>
     <w:p>
@@ -6585,15 +6215,7 @@
         <w:t>1-to-N Household Hierarchies:</w:t>
       </w:r>
       <w:r>
-        <w:t xml:space="preserve"> The primary user's account links to a child `</w:t>
-      </w:r>
-      <w:proofErr w:type="spellStart"/>
-      <w:r>
-        <w:t>family_members</w:t>
-      </w:r>
-      <w:proofErr w:type="spellEnd"/>
-      <w:r>
-        <w:t>` table to allow tracking dependents with isolated calorie and allergy thresholds.</w:t>
+        <w:t xml:space="preserve"> The primary user's account links to a child `family_members` table to allow tracking dependents with isolated calorie and allergy thresholds.</w:t>
       </w:r>
     </w:p>
     <w:p>
@@ -6608,31 +6230,7 @@
         <w:t>Transactional Event Logs:</w:t>
       </w:r>
       <w:r>
-        <w:t xml:space="preserve"> Tables for `</w:t>
-      </w:r>
-      <w:proofErr w:type="spellStart"/>
-      <w:r>
-        <w:t>meal_logs</w:t>
-      </w:r>
-      <w:proofErr w:type="spellEnd"/>
-      <w:r>
-        <w:t>`, `</w:t>
-      </w:r>
-      <w:proofErr w:type="spellStart"/>
-      <w:r>
-        <w:t>water_logs</w:t>
-      </w:r>
-      <w:proofErr w:type="spellEnd"/>
-      <w:r>
-        <w:t>`, and `</w:t>
-      </w:r>
-      <w:proofErr w:type="spellStart"/>
-      <w:r>
-        <w:t>chat_history</w:t>
-      </w:r>
-      <w:proofErr w:type="spellEnd"/>
-      <w:r>
-        <w:t>` store discrete logged events with timestamps, foreign keys, and synchronization markers.</w:t>
+        <w:t xml:space="preserve"> Tables for `meal_logs`, `water_logs`, and `chat_history` store discrete logged events with timestamps, foreign keys, and synchronization markers.</w:t>
       </w:r>
     </w:p>
     <w:p>
@@ -6647,15 +6245,7 @@
         <w:t>Algorithmic Score tracking:</w:t>
       </w:r>
       <w:r>
-        <w:t xml:space="preserve"> The `</w:t>
-      </w:r>
-      <w:proofErr w:type="spellStart"/>
-      <w:r>
-        <w:t>habit_scores</w:t>
-      </w:r>
-      <w:proofErr w:type="spellEnd"/>
-      <w:r>
-        <w:t>` table tracks rolling 30-day nutrition scores and tracking streak milestones to drive user behavior consistency.</w:t>
+        <w:t xml:space="preserve"> The `habit_scores` table tracks rolling 30-day nutrition scores and tracking streak milestones to drive user behavior consistency.</w:t>
       </w:r>
     </w:p>
     <w:p>
@@ -6752,15 +6342,7 @@
         <w:t>Conversational Prompt Capture:</w:t>
       </w:r>
       <w:r>
-        <w:t xml:space="preserve"> The user enters a natural language meal text (e.g., '1 plate </w:t>
-      </w:r>
-      <w:proofErr w:type="spellStart"/>
-      <w:r>
-        <w:t>Daal</w:t>
-      </w:r>
-      <w:proofErr w:type="spellEnd"/>
-      <w:r>
-        <w:t xml:space="preserve"> Chawal with salad') which is sent directly to the FastAPI server.</w:t>
+        <w:t xml:space="preserve"> The user enters a natural language meal text (e.g., '1 plate Daal Chawal with salad') which is sent directly to the FastAPI server.</w:t>
       </w:r>
     </w:p>
     <w:p>
@@ -6806,15 +6388,7 @@
         <w:t>Instant Local Commit:</w:t>
       </w:r>
       <w:r>
-        <w:t xml:space="preserve"> On user confirmation, the Flutter app instantly saves the entry in the local SQLite table (`</w:t>
-      </w:r>
-      <w:proofErr w:type="spellStart"/>
-      <w:r>
-        <w:t>is_synced</w:t>
-      </w:r>
-      <w:proofErr w:type="spellEnd"/>
-      <w:r>
-        <w:t xml:space="preserve"> = false`) to refresh UI rings instantly.</w:t>
+        <w:t xml:space="preserve"> On user confirmation, the Flutter app instantly saves the entry in the local SQLite table (`is_synced = false`) to refresh UI rings instantly.</w:t>
       </w:r>
     </w:p>
     <w:p>
@@ -6829,15 +6403,7 @@
         <w:t>Background Data Mirror:</w:t>
       </w:r>
       <w:r>
-        <w:t xml:space="preserve"> A background sync worker uploads the meal log to </w:t>
-      </w:r>
-      <w:proofErr w:type="spellStart"/>
-      <w:r>
-        <w:t>Supabase</w:t>
-      </w:r>
-      <w:proofErr w:type="spellEnd"/>
-      <w:r>
-        <w:t xml:space="preserve"> in a transaction and switches the SQLite sync flag to `true`.</w:t>
+        <w:t xml:space="preserve"> A background sync worker uploads the meal log to Supabase in a transaction and switches the SQLite sync flag to `true`.</w:t>
       </w:r>
     </w:p>
     <w:p>
@@ -6898,15 +6464,7 @@
         <w:t>(3)</w:t>
       </w:r>
       <w:r>
-        <w:t xml:space="preserve"> FastAPI prompts </w:t>
-      </w:r>
-      <w:proofErr w:type="spellStart"/>
-      <w:r>
-        <w:t>GeminiPool</w:t>
-      </w:r>
-      <w:proofErr w:type="spellEnd"/>
-      <w:r>
-        <w:t xml:space="preserve"> with USDA and South Asian culinary groundings. </w:t>
+        <w:t xml:space="preserve"> FastAPI prompts GeminiPool with USDA and South Asian culinary groundings. </w:t>
       </w:r>
     </w:p>
     <w:p>
@@ -6951,15 +6509,7 @@
         <w:t>(6)</w:t>
       </w:r>
       <w:r>
-        <w:t xml:space="preserve"> On confirmation, row is written to local SQLite and queued for background </w:t>
-      </w:r>
-      <w:proofErr w:type="spellStart"/>
-      <w:r>
-        <w:t>Supabase</w:t>
-      </w:r>
-      <w:proofErr w:type="spellEnd"/>
-      <w:r>
-        <w:t xml:space="preserve"> push.</w:t>
+        <w:t xml:space="preserve"> On confirmation, row is written to local SQLite and queued for background Supabase push.</w:t>
       </w:r>
     </w:p>
     <w:p>
@@ -7065,23 +6615,7 @@
         <w:t>Automated Key Interception:</w:t>
       </w:r>
       <w:r>
-        <w:t xml:space="preserve"> When a rate-limit error is caught, the </w:t>
-      </w:r>
-      <w:proofErr w:type="spellStart"/>
-      <w:r>
-        <w:t>Uvicorn</w:t>
-      </w:r>
-      <w:proofErr w:type="spellEnd"/>
-      <w:r>
-        <w:t xml:space="preserve"> gateway blocks standard flow and triggers the thread-safe `</w:t>
-      </w:r>
-      <w:proofErr w:type="spellStart"/>
-      <w:r>
-        <w:t>GeminiPool</w:t>
-      </w:r>
-      <w:proofErr w:type="spellEnd"/>
-      <w:r>
-        <w:t>` key rotation.</w:t>
+        <w:t xml:space="preserve"> When a rate-limit error is caught, the Uvicorn gateway blocks standard flow and triggers the thread-safe `GeminiPool` key rotation.</w:t>
       </w:r>
     </w:p>
     <w:p>
@@ -7248,15 +6782,7 @@
         <w:t>External Integration Connectors:</w:t>
       </w:r>
       <w:r>
-        <w:t xml:space="preserve"> Unified interfaces decouple the core backend code from third-party services like OpenStreetMap geocoding and the </w:t>
-      </w:r>
-      <w:proofErr w:type="spellStart"/>
-      <w:r>
-        <w:t>OpenFoodFacts</w:t>
-      </w:r>
-      <w:proofErr w:type="spellEnd"/>
-      <w:r>
-        <w:t xml:space="preserve"> database.</w:t>
+        <w:t xml:space="preserve"> Unified interfaces decouple the core backend code from third-party services like OpenStreetMap geocoding and the OpenFoodFacts database.</w:t>
       </w:r>
     </w:p>
     <w:p>
@@ -7271,15 +6797,7 @@
         <w:t>Database Bridges:</w:t>
       </w:r>
       <w:r>
-        <w:t xml:space="preserve"> SQLite database services (client-side) and </w:t>
-      </w:r>
-      <w:proofErr w:type="spellStart"/>
-      <w:r>
-        <w:t>Supabase</w:t>
-      </w:r>
-      <w:proofErr w:type="spellEnd"/>
-      <w:r>
-        <w:t xml:space="preserve"> Client APIs (cloud-side) are encapsulated to allow backend or storage modifications without UI changes.</w:t>
+        <w:t xml:space="preserve"> SQLite database services (client-side) and Supabase Client APIs (cloud-side) are encapsulated to allow backend or storage modifications without UI changes.</w:t>
       </w:r>
     </w:p>
     <w:p>
@@ -7516,15 +7034,7 @@
         <w:t>Resilient Offline Path:</w:t>
       </w:r>
       <w:r>
-        <w:t xml:space="preserve"> If offline, the transaction is logged to SQLite with `</w:t>
-      </w:r>
-      <w:proofErr w:type="spellStart"/>
-      <w:r>
-        <w:t>is_synced</w:t>
-      </w:r>
-      <w:proofErr w:type="spellEnd"/>
-      <w:r>
-        <w:t xml:space="preserve"> = false`, and a visual "saved offline" message is displayed.</w:t>
+        <w:t xml:space="preserve"> If offline, the transaction is logged to SQLite with `is_synced = false`, and a visual "saved offline" message is displayed.</w:t>
       </w:r>
     </w:p>
     <w:p>
@@ -7546,32 +7056,15 @@
       <w:pPr>
         <w:pStyle w:val="BulletPoint"/>
       </w:pPr>
-      <w:proofErr w:type="spellStart"/>
-      <w:r>
-        <w:rPr>
-          <w:b/>
-          <w:bCs/>
-        </w:rPr>
-        <w:t>Supabase</w:t>
-      </w:r>
-      <w:proofErr w:type="spellEnd"/>
-      <w:r>
-        <w:rPr>
-          <w:b/>
-          <w:bCs/>
-        </w:rPr>
-        <w:t xml:space="preserve"> Push:</w:t>
-      </w:r>
-      <w:r>
-        <w:t xml:space="preserve"> The worker batch-uploads pending records, handles synchronization conflicts, and updates local rows as fully synchronized (`</w:t>
-      </w:r>
-      <w:proofErr w:type="spellStart"/>
-      <w:r>
-        <w:t>is_synced</w:t>
-      </w:r>
-      <w:proofErr w:type="spellEnd"/>
-      <w:r>
-        <w:t xml:space="preserve"> = true`).</w:t>
+      <w:r>
+        <w:rPr>
+          <w:b/>
+          <w:bCs/>
+        </w:rPr>
+        <w:t>Supabase Push:</w:t>
+      </w:r>
+      <w:r>
+        <w:t xml:space="preserve"> The worker batch-uploads pending records, handles synchronization conflicts, and updates local rows as fully synchronized (`is_synced = true`).</w:t>
       </w:r>
     </w:p>
     <w:p>
@@ -7663,15 +7156,7 @@
         <w:t>Multi-Platform Client Runtimes:</w:t>
       </w:r>
       <w:r>
-        <w:t xml:space="preserve"> Clients run natively on Android devices (downloaded via GitHub Releases v1.0.0) or in modern web browsers (hosted on </w:t>
-      </w:r>
-      <w:proofErr w:type="spellStart"/>
-      <w:r>
-        <w:t>Vercel</w:t>
-      </w:r>
-      <w:proofErr w:type="spellEnd"/>
-      <w:r>
-        <w:t>).</w:t>
+        <w:t xml:space="preserve"> Clients run natively on Android devices (downloaded via GitHub Releases v1.0.0) or in modern web browsers (hosted on Vercel).</w:t>
       </w:r>
     </w:p>
     <w:p>
@@ -7686,15 +7171,7 @@
         <w:t>Containerized REST Nodes:</w:t>
       </w:r>
       <w:r>
-        <w:t xml:space="preserve"> The FastAPI server runs in a containerized environment (hosted on Render / GCP) with </w:t>
-      </w:r>
-      <w:proofErr w:type="spellStart"/>
-      <w:r>
-        <w:t>Uvicorn</w:t>
-      </w:r>
-      <w:proofErr w:type="spellEnd"/>
-      <w:r>
-        <w:t xml:space="preserve"> ASGI servers handling client requests.</w:t>
+        <w:t xml:space="preserve"> The FastAPI server runs in a containerized environment (hosted on Render / GCP) with Uvicorn ASGI servers handling client requests.</w:t>
       </w:r>
     </w:p>
     <w:p>
@@ -7709,15 +7186,7 @@
         <w:t>Database Cloud Layer:</w:t>
       </w:r>
       <w:r>
-        <w:t xml:space="preserve"> </w:t>
-      </w:r>
-      <w:proofErr w:type="spellStart"/>
-      <w:r>
-        <w:t>Supabase</w:t>
-      </w:r>
-      <w:proofErr w:type="spellEnd"/>
-      <w:r>
-        <w:t xml:space="preserve"> runs on a managed cloud container hosting PostgreSQL, executing Row-Level Security policies and secure JSON Web Token verification.</w:t>
+        <w:t xml:space="preserve"> Supabase runs on a managed cloud container hosting PostgreSQL, executing Row-Level Security policies and secure JSON Web Token verification.</w:t>
       </w:r>
     </w:p>
     <w:p>
@@ -7732,15 +7201,7 @@
         <w:t>Protected Server Gateways:</w:t>
       </w:r>
       <w:r>
-        <w:t xml:space="preserve"> Cloudflare SSL edges secure the server nodes, shielding </w:t>
-      </w:r>
-      <w:proofErr w:type="spellStart"/>
-      <w:r>
-        <w:t>Uvicorn</w:t>
-      </w:r>
-      <w:proofErr w:type="spellEnd"/>
-      <w:r>
-        <w:t xml:space="preserve"> ASGI backends from DDoS attacks and unauthorized network requests.</w:t>
+        <w:t xml:space="preserve"> Cloudflare SSL edges secure the server nodes, shielding Uvicorn ASGI backends from DDoS attacks and unauthorized network requests.</w:t>
       </w:r>
     </w:p>
     <w:p>
@@ -7861,15 +7322,7 @@
         <w:t>Medical &amp; Target Profile Lookup:</w:t>
       </w:r>
       <w:r>
-        <w:t xml:space="preserve"> The FastAPI server queries </w:t>
-      </w:r>
-      <w:proofErr w:type="spellStart"/>
-      <w:r>
-        <w:t>Supabase</w:t>
-      </w:r>
-      <w:proofErr w:type="spellEnd"/>
-      <w:r>
-        <w:t xml:space="preserve"> to retrieve age, weight, target goal, and active medical restrictions (e.g., Hypertension or Diabetes).</w:t>
+        <w:t xml:space="preserve"> The FastAPI server queries Supabase to retrieve age, weight, target goal, and active medical restrictions (e.g., Hypertension or Diabetes).</w:t>
       </w:r>
     </w:p>
     <w:p>
@@ -7899,23 +7352,7 @@
         <w:t>Double-Database Caching:</w:t>
       </w:r>
       <w:r>
-        <w:t xml:space="preserve"> The generated workout plan is saved in </w:t>
-      </w:r>
-      <w:proofErr w:type="spellStart"/>
-      <w:r>
-        <w:t>Supabase</w:t>
-      </w:r>
-      <w:proofErr w:type="spellEnd"/>
-      <w:r>
-        <w:t xml:space="preserve"> PostgreSQL and </w:t>
-      </w:r>
-      <w:proofErr w:type="gramStart"/>
-      <w:r>
-        <w:t>cached</w:t>
-      </w:r>
-      <w:proofErr w:type="gramEnd"/>
-      <w:r>
-        <w:t xml:space="preserve"> locally in the client SQLite database.</w:t>
+        <w:t xml:space="preserve"> The generated workout plan is saved in Supabase PostgreSQL and cached locally in the client SQLite database.</w:t>
       </w:r>
     </w:p>
     <w:p>
@@ -7985,23 +7422,7 @@
         <w:t>(2)</w:t>
       </w:r>
       <w:r>
-        <w:t xml:space="preserve"> Backend </w:t>
-      </w:r>
-      <w:proofErr w:type="gramStart"/>
-      <w:r>
-        <w:t>queries</w:t>
-      </w:r>
-      <w:proofErr w:type="gramEnd"/>
-      <w:r>
-        <w:t xml:space="preserve"> profile metrics and medical restrictions from </w:t>
-      </w:r>
-      <w:proofErr w:type="spellStart"/>
-      <w:r>
-        <w:t>Supabase</w:t>
-      </w:r>
-      <w:proofErr w:type="spellEnd"/>
-      <w:r>
-        <w:t xml:space="preserve">. </w:t>
+        <w:t xml:space="preserve"> Backend queries profile metrics and medical restrictions from Supabase. </w:t>
       </w:r>
     </w:p>
     <w:p>
@@ -8039,15 +7460,7 @@
         <w:t>(4)</w:t>
       </w:r>
       <w:r>
-        <w:t xml:space="preserve"> Workout plan is saved to </w:t>
-      </w:r>
-      <w:proofErr w:type="spellStart"/>
-      <w:r>
-        <w:t>Supabase</w:t>
-      </w:r>
-      <w:proofErr w:type="spellEnd"/>
-      <w:r>
-        <w:t xml:space="preserve"> and cached locally in SQLite. </w:t>
+        <w:t xml:space="preserve"> Workout plan is saved to Supabase and cached locally in SQLite. </w:t>
       </w:r>
     </w:p>
     <w:p>
@@ -8066,23 +7479,7 @@
         <w:t>(5)</w:t>
       </w:r>
       <w:r>
-        <w:t xml:space="preserve"> User checks off completed exercises, triggering </w:t>
-      </w:r>
-      <w:proofErr w:type="spellStart"/>
-      <w:r>
-        <w:t>toggleExerciseCompletion</w:t>
-      </w:r>
-      <w:proofErr w:type="spellEnd"/>
-      <w:r>
-        <w:t xml:space="preserve"> locally and updating </w:t>
-      </w:r>
-      <w:proofErr w:type="spellStart"/>
-      <w:r>
-        <w:t>Supabase</w:t>
-      </w:r>
-      <w:proofErr w:type="spellEnd"/>
-      <w:r>
-        <w:t>.</w:t>
+        <w:t xml:space="preserve"> User checks off completed exercises, triggering toggleExerciseCompletion locally and updating Supabase.</w:t>
       </w:r>
     </w:p>
     <w:p>
@@ -8179,23 +7576,7 @@
         <w:t>Nutrition Telemetry Sync:</w:t>
       </w:r>
       <w:r>
-        <w:t xml:space="preserve"> The </w:t>
-      </w:r>
-      <w:proofErr w:type="spellStart"/>
-      <w:r>
-        <w:t>SyncService</w:t>
-      </w:r>
-      <w:proofErr w:type="spellEnd"/>
-      <w:r>
-        <w:t xml:space="preserve"> uploads all meal logs to </w:t>
-      </w:r>
-      <w:proofErr w:type="spellStart"/>
-      <w:r>
-        <w:t>Supabase</w:t>
-      </w:r>
-      <w:proofErr w:type="spellEnd"/>
-      <w:r>
-        <w:t>, making the raw meal history available for rolling telemetry calculations.</w:t>
+        <w:t xml:space="preserve"> The SyncService uploads all meal logs to Supabase, making the raw meal history available for rolling telemetry calculations.</w:t>
       </w:r>
     </w:p>
     <w:p>
@@ -8289,15 +7670,7 @@
         <w:t>(1)</w:t>
       </w:r>
       <w:r>
-        <w:t xml:space="preserve"> </w:t>
-      </w:r>
-      <w:proofErr w:type="spellStart"/>
-      <w:r>
-        <w:t>SyncService</w:t>
-      </w:r>
-      <w:proofErr w:type="spellEnd"/>
-      <w:r>
-        <w:t xml:space="preserve"> pushes meal logs to Cloud DB. </w:t>
+        <w:t xml:space="preserve"> SyncService pushes meal logs to Cloud DB. </w:t>
       </w:r>
     </w:p>
     <w:p>
@@ -8423,15 +7796,7 @@
         <w:t>Bilingual Natural Language Parsing:</w:t>
       </w:r>
       <w:r>
-        <w:t xml:space="preserve"> Accurately understands colloquial meal names (e.g., '2 Aloo Parathas and 1 Chai', '</w:t>
-      </w:r>
-      <w:proofErr w:type="spellStart"/>
-      <w:r>
-        <w:t>Daal</w:t>
-      </w:r>
-      <w:proofErr w:type="spellEnd"/>
-      <w:r>
-        <w:t xml:space="preserve"> Chawal with salad', 'Grilled Salmon with quinoa').</w:t>
+        <w:t xml:space="preserve"> Accurately understands colloquial meal names (e.g., '2 Aloo Parathas and 1 Chai', 'Daal Chawal with salad', 'Grilled Salmon with quinoa').</w:t>
       </w:r>
     </w:p>
     <w:p>
@@ -8481,15 +7846,7 @@
         <w:pStyle w:val="Para"/>
       </w:pPr>
       <w:r>
-        <w:t>To deliver enterprise SLA standards, the `</w:t>
-      </w:r>
-      <w:proofErr w:type="spellStart"/>
-      <w:r>
-        <w:t>GeminiPool</w:t>
-      </w:r>
-      <w:proofErr w:type="spellEnd"/>
-      <w:r>
-        <w:t>` singleton implements thread-safe key management:</w:t>
+        <w:t>To deliver enterprise SLA standards, the `GeminiPool` singleton implements thread-safe key management:</w:t>
       </w:r>
     </w:p>
     <w:p>
@@ -8553,13 +7910,8 @@
       <w:pPr>
         <w:pStyle w:val="Para"/>
       </w:pPr>
-      <w:proofErr w:type="spellStart"/>
-      <w:r>
-        <w:t>NutriSense</w:t>
-      </w:r>
-      <w:proofErr w:type="spellEnd"/>
-      <w:r>
-        <w:t xml:space="preserve"> allows a primary account holder to manage the nutritional wellness of their entire household:</w:t>
+      <w:r>
+        <w:t>NutriSense allows a primary account holder to manage the nutritional wellness of their entire household:</w:t>
       </w:r>
     </w:p>
     <w:p>
@@ -8589,15 +7941,7 @@
         <w:t>Allergy &amp; Medical Rules per Member:</w:t>
       </w:r>
       <w:r>
-        <w:t xml:space="preserve"> Enforces isolated safety guardrails (e.g., flagging peanut allergens for Child A while tracking </w:t>
-      </w:r>
-      <w:proofErr w:type="gramStart"/>
-      <w:r>
-        <w:t>low-sodium</w:t>
-      </w:r>
-      <w:proofErr w:type="gramEnd"/>
-      <w:r>
-        <w:t xml:space="preserve"> for Parent B).</w:t>
+        <w:t xml:space="preserve"> Enforces isolated safety guardrails (e.g., flagging peanut allergens for Child A while tracking low-sodium for Parent B).</w:t>
       </w:r>
     </w:p>
     <w:p>
@@ -8678,15 +8022,7 @@
         <w:t>Targeted Hydration Presets:</w:t>
       </w:r>
       <w:r>
-        <w:t xml:space="preserve"> Provides 1-tap logging chips tailored for non-fasting windows (+500ml Iftar, +250ml </w:t>
-      </w:r>
-      <w:proofErr w:type="spellStart"/>
-      <w:r>
-        <w:t>Taraweeh</w:t>
-      </w:r>
-      <w:proofErr w:type="spellEnd"/>
-      <w:r>
-        <w:t>, +500ml Sehri).</w:t>
+        <w:t xml:space="preserve"> Provides 1-tap logging chips tailored for non-fasting windows (+500ml Iftar, +250ml Taraweeh, +500ml Sehri).</w:t>
       </w:r>
     </w:p>
     <w:p>
@@ -8701,15 +8037,7 @@
         <w:t>Dynamic Meal Categorization:</w:t>
       </w:r>
       <w:r>
-        <w:t xml:space="preserve"> Replaces standard Breakfast/Lunch slots with Sehri, Iftar, and Post-</w:t>
-      </w:r>
-      <w:proofErr w:type="spellStart"/>
-      <w:r>
-        <w:t>Taraweeh</w:t>
-      </w:r>
-      <w:proofErr w:type="spellEnd"/>
-      <w:r>
-        <w:t xml:space="preserve"> Snack.</w:t>
+        <w:t xml:space="preserve"> Replaces standard Breakfast/Lunch slots with Sehri, Iftar, and Post-Taraweeh Snack.</w:t>
       </w:r>
     </w:p>
     <w:p>
@@ -8759,15 +8087,7 @@
         <w:t>Bilingual Text-To-Speech (TTS):</w:t>
       </w:r>
       <w:r>
-        <w:t xml:space="preserve"> Reads coaching responses aloud in natural English or Urdu via `</w:t>
-      </w:r>
-      <w:proofErr w:type="spellStart"/>
-      <w:r>
-        <w:t>flutter_tts</w:t>
-      </w:r>
-      <w:proofErr w:type="spellEnd"/>
-      <w:r>
-        <w:t>`.</w:t>
+        <w:t xml:space="preserve"> Reads coaching responses aloud in natural English or Urdu via `flutter_tts`.</w:t>
       </w:r>
     </w:p>
     <w:p>
@@ -8867,15 +8187,7 @@
         <w:pStyle w:val="Para"/>
       </w:pPr>
       <w:r>
-        <w:t xml:space="preserve">Aggregates 7-day health telemetry into professional clinical reports using </w:t>
-      </w:r>
-      <w:proofErr w:type="spellStart"/>
-      <w:r>
-        <w:t>ReportLab</w:t>
-      </w:r>
-      <w:proofErr w:type="spellEnd"/>
-      <w:r>
-        <w:t>:</w:t>
+        <w:t>Aggregates 7-day health telemetry into professional clinical reports using ReportLab:</w:t>
       </w:r>
     </w:p>
     <w:p>
@@ -8944,15 +8256,7 @@
         <w:pStyle w:val="Para"/>
       </w:pPr>
       <w:r>
-        <w:t xml:space="preserve">Empowers users with personalized, </w:t>
-      </w:r>
-      <w:proofErr w:type="gramStart"/>
-      <w:r>
-        <w:t>clinically-safe</w:t>
-      </w:r>
-      <w:proofErr w:type="gramEnd"/>
-      <w:r>
-        <w:t xml:space="preserve"> physical training regimens tailored to their specific fitness goals, medical history, and physical profile:</w:t>
+        <w:t>Empowers users with personalized, clinically-safe physical training regimens tailored to their specific fitness goals, medical history, and physical profile:</w:t>
       </w:r>
     </w:p>
     <w:p>
@@ -9109,15 +8413,7 @@
         <w:t>JWT Bearer Tokens:</w:t>
       </w:r>
       <w:r>
-        <w:t xml:space="preserve"> All client-server communications require cryptographically signed JSON Web Tokens issued by </w:t>
-      </w:r>
-      <w:proofErr w:type="spellStart"/>
-      <w:r>
-        <w:t>Supabase</w:t>
-      </w:r>
-      <w:proofErr w:type="spellEnd"/>
-      <w:r>
-        <w:t xml:space="preserve"> Auth.</w:t>
+        <w:t xml:space="preserve"> All client-server communications require cryptographically signed JSON Web Tokens issued by Supabase Auth.</w:t>
       </w:r>
     </w:p>
     <w:p>
@@ -9174,23 +8470,7 @@
         <w:t>Row-Level Security Policies:</w:t>
       </w:r>
       <w:r>
-        <w:t xml:space="preserve"> PostgreSQL RLS policies enforce that users can only SELECT, INSERT, UPDATE, or DELETE records where `</w:t>
-      </w:r>
-      <w:proofErr w:type="spellStart"/>
-      <w:r>
-        <w:t>user_id</w:t>
-      </w:r>
-      <w:proofErr w:type="spellEnd"/>
-      <w:r>
-        <w:t xml:space="preserve"> == </w:t>
-      </w:r>
-      <w:proofErr w:type="spellStart"/>
-      <w:r>
-        <w:t>auth.uid</w:t>
-      </w:r>
-      <w:proofErr w:type="spellEnd"/>
-      <w:r>
-        <w:t>()`.</w:t>
+        <w:t xml:space="preserve"> PostgreSQL RLS policies enforce that users can only SELECT, INSERT, UPDATE, or DELETE records where `user_id == auth.uid()`.</w:t>
       </w:r>
     </w:p>
     <w:p>
@@ -9263,15 +8543,7 @@
         <w:t>60 FPS Smooth Rendering:</w:t>
       </w:r>
       <w:r>
-        <w:t xml:space="preserve"> Flutter UI utilizes const constructors, isolated </w:t>
-      </w:r>
-      <w:proofErr w:type="spellStart"/>
-      <w:r>
-        <w:t>ListenableBuilder</w:t>
-      </w:r>
-      <w:proofErr w:type="spellEnd"/>
-      <w:r>
-        <w:t xml:space="preserve"> rebuild scopes, and image caching.</w:t>
+        <w:t xml:space="preserve"> Flutter UI utilizes const constructors, isolated ListenableBuilder rebuild scopes, and image caching.</w:t>
       </w:r>
     </w:p>
     <w:p>
@@ -9407,7 +8679,25 @@
               <w:sz w:val="15"/>
               <w:szCs w:val="15"/>
             </w:rPr>
-            <w:t>Developers – Jamal and Affan</w:t>
+            <w:t>Develope</w:t>
+          </w:r>
+          <w:r>
+            <w:rPr>
+              <w:rFonts w:ascii="Calibri" w:eastAsia="Calibri" w:hAnsi="Calibri" w:cs="Calibri"/>
+              <w:color w:val="555E6D"/>
+              <w:sz w:val="15"/>
+              <w:szCs w:val="15"/>
+            </w:rPr>
+            <w:t>d by</w:t>
+          </w:r>
+          <w:r>
+            <w:rPr>
+              <w:rFonts w:ascii="Calibri" w:eastAsia="Calibri" w:hAnsi="Calibri" w:cs="Calibri"/>
+              <w:color w:val="555E6D"/>
+              <w:sz w:val="15"/>
+              <w:szCs w:val="15"/>
+            </w:rPr>
+            <w:t xml:space="preserve"> Jamal and Affan</w:t>
           </w:r>
         </w:p>
       </w:tc>
@@ -9600,7 +8890,6 @@
           <w:vAlign w:val="center"/>
         </w:tcPr>
         <w:p>
-          <w:proofErr w:type="spellStart"/>
           <w:r>
             <w:rPr>
               <w:rFonts w:ascii="Poppins" w:eastAsia="Poppins" w:hAnsi="Poppins" w:cs="Poppins"/>
@@ -9612,7 +8901,6 @@
             </w:rPr>
             <w:t>NutriSense</w:t>
           </w:r>
-          <w:proofErr w:type="spellEnd"/>
         </w:p>
       </w:tc>
       <w:tc>
@@ -10517,6 +9805,7 @@
   <w:style w:type="character" w:default="1" w:styleId="DefaultParagraphFont">
     <w:name w:val="Default Paragraph Font"/>
     <w:uiPriority w:val="1"/>
+    <w:semiHidden/>
     <w:unhideWhenUsed/>
   </w:style>
   <w:style w:type="table" w:default="1" w:styleId="TableNormal">

</xml_diff>